<commit_message>
feat: bilingual EN/ZH toggle + more questions via ingest
- Add language field to State, session, schema and qa_service
- Teacher/Student agents respect language preference from session
- Add {language_instruction} to both agent prompts
- Add i18n.js with EN/ZH dictionary and toggle logic
- Wire lang toggle button into all page navs (data-i18n attrs)
- chat.js passes language when creating session and in welcome msg

Co-authored-by: Cursor <cursoragent@cursor.com>
</commit_message>
<xml_diff>
--- a/deliverables/EasyEdu_AI_Innovation_Narrative.docx
+++ b/deliverables/EasyEdu_AI_Innovation_Narrative.docx
@@ -101,7 +101,7 @@
           <w:i w:val="0"/>
           <w:sz w:val="24"/>
         </w:rPr>
-        <w:t>The trouble is that this kind of “explain, and be questioned” practice has always depended on a patient teacher sitting beside each student — something no school can offer to every learner, on every problem, every day. One-on-one Socratic dialogue is the most effective form of tutoring we know, and also the least scalable and the most expensive. As a result it is rationed: a lucky few get it, while most students are left to review answers alone and hope that recognition will hold up as understanding. The real problem, then, is not a shortage of answers. It is a shortage of the guided dialogue that turns a correct answer into genuine, durable understanding.</w:t>
+        <w:t>The trouble is that this kind of “explain, and be questioned” practice has always depended on a patient teacher sitting beside each student — something no school can offer to every learner, on every problem, every day. One-on-one Socratic dialogue is the most effective form of tutoring we know, and also the least scalable and the most expensive. The real problem, then, is not a shortage of answers. It is a shortage of the guided dialogue that turns a correct answer into genuine, durable understanding.</w:t>
       </w:r>
     </w:p>
     <w:p>
@@ -130,7 +130,7 @@
           <w:i w:val="0"/>
           <w:sz w:val="24"/>
         </w:rPr>
-        <w:t>EasyEdu reverses the usual relationship between a student and an AI. Instead of the student asking and the AI answering, the student explains the problem to the AI, and the AI listens, questions, and guides — just as an attentive tutor would. The interface is deliberately simple: a learner picks a question from their course, then types or speaks their reasoning as if teaching a classmate. What happens next is what makes EasyEdu different. Behind the conversation are three cooperating agents, each playing a familiar classroom role:</w:t>
+        <w:t>EasyEdu reverses the usual relationship between a student and an AI. Instead of the student asking and the AI answering, the student explains the problem to the AI, and the AI listens, questions, and guides — just as an attentive tutor would. The interface is deliberately simple: a learner picks a question from their course, then types their reasoning as if teaching a classmate. What happens next is decided by a team of three cooperating agents, each playing a familiar classroom role:</w:t>
       </w:r>
     </w:p>
     <w:p>
@@ -180,7 +180,7 @@
           <w:i w:val="0"/>
           <w:sz w:val="24"/>
         </w:rPr>
-        <w:t>a curious peer, takes over when the explanation is right but shallow, asking the next “but why?” so the learner reasons one level deeper instead of stopping at the first correct sentence. This is where surface answers are pushed toward real understanding.</w:t>
+        <w:t>a curious peer, takes over when the explanation is right but shallow, asking the next “but why?” so the learner reasons one level deeper instead of stopping at the first correct sentence.</w:t>
       </w:r>
     </w:p>
     <w:p>
@@ -219,7 +219,7 @@
           <w:i w:val="0"/>
           <w:sz w:val="24"/>
         </w:rPr>
-        <w:t>Consider a student explaining why a reaction reaches equilibrium. If they say “the reaction just stops,” the Router flags a misconception and the Teacher gently asks them to reconsider what is happening at the molecular level. If they correctly say the forward and reverse rates become equal but go no further, the Router marks the answer correct-but-shallow and the Student agent asks what that implies about the concentrations — nudging them to the real insight. Only once the explanation holds together does the Teacher summarize the takeaway. Each path mirrors a choice a human tutor makes instinctively, now available to every student on demand.</w:t>
+        <w:t>Consider a student explaining why a reaction reaches equilibrium. If they say “the reaction just stops,” the Router flags a misconception and the Teacher gently asks them to reconsider what is happening at the molecular level. If they correctly say the forward and reverse rates become equal but go no further, the Student agent asks what that implies about the concentrations — nudging them to the real insight. Only once the explanation holds together does the Teacher summarize the takeaway.</w:t>
       </w:r>
     </w:p>
     <w:p>
@@ -233,7 +233,21 @@
           <w:i w:val="0"/>
           <w:sz w:val="24"/>
         </w:rPr>
-        <w:t>Together the three agents turn the Feynman technique into a repeatable loop that any student can run, on any problem, as many times as they need. Feedback streams back word by word, so the exchange feels like a live conversation rather than a form to submit, and the questions a student practises on are drawn from their own course’s textbooks, keeping every dialogue anchored to what they are genuinely studying. The result is not a faster way to get answers, but a way to practise the one skill that produces lasting understanding — explaining clearly under questioning — at a scale no staffroom of tutors could match.</w:t>
+        <w:t>Beyond this core loop, EasyEdu is designed to support an “adversarial mode” in which the AI deliberately holds a wrong belief and the student must argue it out of that position. Rather than explaining a concept to a neutral listener, the learner has to construct a counter-argument — a qualitatively harder cognitive task that demands the deepest level of understanding. If a student can correct a confident misconception in the AI, they have not just recalled the right answer; they have understood why the wrong one is wrong. This mode aligns closely with the argumentation and critical thinking demands of IB Theory of Knowledge and AP free-response questions, and it represents a mode of AI-assisted learning that no current tutoring product offers.</w:t>
+      </w:r>
+    </w:p>
+    <w:p>
+      <w:pPr>
+        <w:jc w:val="both"/>
+      </w:pPr>
+      <w:r>
+        <w:rPr>
+          <w:rFonts w:ascii="Times New Roman" w:hAnsi="Times New Roman" w:eastAsia="Times New Roman"/>
+          <w:b w:val="0"/>
+          <w:i w:val="0"/>
+          <w:sz w:val="24"/>
+        </w:rPr>
+        <w:t>Together, these interaction modes turn the Feynman technique into a repeatable practice that any student can run on any problem as many times as they need. Feedback streams back word by word, so the exchange feels like a live conversation rather than a form to submit, and the questions a student practises on come from their own course’s textbooks, keeping every dialogue anchored to what they are genuinely studying.</w:t>
       </w:r>
     </w:p>
     <w:p>
@@ -287,7 +301,7 @@
           <w:i w:val="0"/>
           <w:sz w:val="24"/>
         </w:rPr>
-        <w:t>We fine-tuned an open model (Qwen2.5-7B) with QLoRA on a single graphics card and serve it ourselves through a high-throughput inference engine (vLLM), behind a small client we wrote in-house. A school therefore never sends student work to an outside service and never pays for each individual question asked.</w:t>
+        <w:t>We fine-tuned an open model (Qwen2.5-7B) with QLoRA on a single graphics card and serve it ourselves through a high-throughput inference engine (vLLM), behind a client we wrote in-house. A school never sends student work to an outside service and never pays for each individual question asked.</w:t>
       </w:r>
     </w:p>
     <w:p>
@@ -337,7 +351,7 @@
           <w:i w:val="0"/>
           <w:sz w:val="24"/>
         </w:rPr>
-        <w:t>The Router does not depend on fragile model “tool calls”; it returns a simple structured judgment that we validate ourselves and retry when needed, at a low temperature for stability. The Teacher’s reference material is looked up in advance and handed to the model rather than left to chance. These choices keep the tutor’s behaviour steady even without a frontier-scale system.</w:t>
+        <w:t>The Router does not depend on fragile model “tool calls”; it returns a simple structured judgment that we validate ourselves and retry when needed, at a low temperature for stability. The Teacher’s reference material is looked up in advance and handed to the model rather than left to chance.</w:t>
       </w:r>
     </w:p>
     <w:p>
@@ -362,7 +376,7 @@
           <w:i w:val="0"/>
           <w:sz w:val="24"/>
         </w:rPr>
-        <w:t>Feedback is delivered token by token in real time over a streaming connection, which we have verified end to end — a single tutoring turn already produces hundreds of streamed fragments, so students see the reply form as they read.</w:t>
+        <w:t>Feedback is delivered token by token in real time over a streaming connection, verified end to end — a single tutoring turn already produces hundreds of streamed fragments, so students see the reply form as they read.</w:t>
       </w:r>
     </w:p>
     <w:p>
@@ -401,7 +415,7 @@
           <w:i w:val="0"/>
           <w:sz w:val="24"/>
         </w:rPr>
-        <w:t>Because the architecture is deliberately not tied to any single AI provider — self-hosting by default, with a commercial model available only as an optional fallback — a school or program can run EasyEdu on ordinary hardware, trust that it will keep working without surprise bills, and keep its teaching data entirely in-house. Feasibility here is not a promise about the future; it is a system that already does what it claims.</w:t>
+        <w:t>Because the architecture is deliberately not tied to any single AI provider — self-hosting by default, with a commercial model available as an optional fallback — a school can run EasyEdu on ordinary hardware, trust that it will keep working without surprise bills, and keep its teaching data entirely in-house.</w:t>
       </w:r>
     </w:p>
     <w:p>
@@ -471,7 +485,7 @@
           <w:i w:val="0"/>
           <w:sz w:val="24"/>
         </w:rPr>
-        <w:t xml:space="preserve">It adapts like a tutor, not a search box. </w:t>
+        <w:t xml:space="preserve">It can argue back. </w:t>
       </w:r>
       <w:r>
         <w:rPr>
@@ -480,7 +494,7 @@
           <w:i w:val="0"/>
           <w:sz w:val="24"/>
         </w:rPr>
-        <w:t>The multi-agent loop decides, turn by turn, whether to push deeper or to correct, mirroring how a good teacher continuously reads a student — instead of returning the same kind of response to everyone.</w:t>
+        <w:t>The adversarial mode goes beyond prompting students to explain — it puts them in the position of correcting a confidently wrong AI. This mirrors the argumentation tasks in IB and AP assessments and produces a depth of engagement that straightforward question-and-answer cannot reach. No existing AI tutoring product offers this interaction model.</w:t>
       </w:r>
     </w:p>
     <w:p>
@@ -496,7 +510,7 @@
           <w:i w:val="0"/>
           <w:sz w:val="24"/>
         </w:rPr>
-        <w:t xml:space="preserve">It scales the scarcest resource in education. </w:t>
+        <w:t xml:space="preserve">It builds a map of each student’s understanding over time. </w:t>
       </w:r>
       <w:r>
         <w:rPr>
@@ -505,7 +519,32 @@
           <w:i w:val="0"/>
           <w:sz w:val="24"/>
         </w:rPr>
-        <w:t>Personalised Socratic questioning has always been limited by teacher time. By automating the patient “why?”, EasyEdu offers that experience to every student, not only those who can afford a private tutor.</w:t>
+        <w:t>Every time a student completes an explanation, the Router’s judgment is recorded against the relevant knowledge point. Over multiple sessions, these accumulate into a personal knowledge map: a live picture of which concepts are solid, which are partially understood, and which remain genuinely weak. A student preparing for exams can see at a glance where to focus; a teacher can look across the class and see which topics need more time. This longitudinal layer of understanding is only possible because every interaction stays within the institution — it cannot be built when student data is scattered across a third-party cloud.</w:t>
+      </w:r>
+    </w:p>
+    <w:p>
+      <w:pPr>
+        <w:pStyle w:val="ListBullet"/>
+        <w:spacing w:after="60"/>
+        <w:jc w:val="both"/>
+      </w:pPr>
+      <w:r>
+        <w:rPr>
+          <w:rFonts w:ascii="Times New Roman" w:hAnsi="Times New Roman" w:eastAsia="Times New Roman"/>
+          <w:b/>
+          <w:i w:val="0"/>
+          <w:sz w:val="24"/>
+        </w:rPr>
+        <w:t xml:space="preserve">It adapts like a tutor, not a search box. </w:t>
+      </w:r>
+      <w:r>
+        <w:rPr>
+          <w:rFonts w:ascii="Times New Roman" w:hAnsi="Times New Roman" w:eastAsia="Times New Roman"/>
+          <w:b w:val="0"/>
+          <w:i w:val="0"/>
+          <w:sz w:val="24"/>
+        </w:rPr>
+        <w:t>The multi-agent loop decides, turn by turn, whether to push deeper or to correct, mirroring how a good teacher continuously reads a student, instead of returning the same kind of response to everyone.</w:t>
       </w:r>
     </w:p>
     <w:p>
@@ -530,7 +569,7 @@
           <w:i w:val="0"/>
           <w:sz w:val="24"/>
         </w:rPr>
-        <w:t>The question bank and every student’s work stay within the institution, and the content follows the school’s own curriculum and licensed textbooks rather than a generic, one-size-fits-all syllabus.</w:t>
+        <w:t>The question bank and every student’s work stay within the institution, and the content follows the school’s own curriculum and licensed textbooks rather than a generic syllabus.</w:t>
       </w:r>
     </w:p>
     <w:p>
@@ -569,7 +608,7 @@
           <w:i w:val="0"/>
           <w:sz w:val="24"/>
         </w:rPr>
-        <w:t>There is also a benefit for teachers. EasyEdu does not replace them; it absorbs the endless, repetitive one-on-one questioning that no teacher has time for, and surfaces where students are actually struggling — freeing teachers to spend their limited hours on the judgement and encouragement only a human can give. Where other tools make it easier to get an answer, EasyEdu makes it harder for a student to fool themselves — and that, for educators, is precisely the point.</w:t>
+        <w:t>There is also a benefit for teachers. EasyEdu does not replace them; it absorbs the repetitive one-on-one questioning that no teacher has time for, and surfaces where students are actually struggling — freeing teachers to spend their limited hours on the judgement and encouragement only a human can give. Where other tools make it easier to get an answer, EasyEdu makes it harder for a student to fool themselves — and that, for educators, is precisely the point.</w:t>
       </w:r>
     </w:p>
     <w:p>
@@ -626,7 +665,7 @@
           <w:i w:val="0"/>
           <w:sz w:val="24"/>
         </w:rPr>
-        <w:t>We plan to begin with a focused pilot — one AP course and one IB course — and to grow subject by subject, learning from real classrooms as we go. Each new course is mostly a matter of running a school’s textbooks through the ingestion pipeline, so expansion is a process we already have, not a system we still have to invent. Success is measured in educational terms rather than usage alone: whether students complete a full explanation cycle, how the depth of their explanations grows over time (a signal our Router already produces), and how much one-on-one pressure is lifted from teachers so they can spend their time where it matters most.</w:t>
+        <w:t>We plan to begin with a focused pilot — one AP course and one IB course — and to grow subject by subject, learning from real classrooms as we go. Each new course is mostly a matter of running a school’s textbooks through the ingestion pipeline, so expansion is a process we already have, not a system we still have to invent. Success is measured in educational terms rather than usage alone: whether students complete a full explanation cycle, how the depth of their explanations grows over time (a signal the Router already produces), how students’ personal knowledge maps evolve across a term, and how much one-on-one pressure is lifted from teachers so they can spend their time where it matters most.</w:t>
       </w:r>
     </w:p>
     <w:p>
@@ -640,7 +679,7 @@
           <w:i w:val="0"/>
           <w:sz w:val="24"/>
         </w:rPr>
-        <w:t>In the end, EasyEdu’s aim is a simple one: to give every student access to the kind of practice that has always produced the deepest understanding — explaining what they know, and being gently questioned until they truly do. It takes the single most effective, least scalable form of teaching and makes it something a school can offer to everyone, every day.</w:t>
+        <w:t>In the end, EasyEdu’s aim is a simple one: to give every student access to the kind of practice that has always produced the deepest understanding — explaining what they know, being questioned until the gaps show, and building a clear picture of what they still need to learn. It takes the single most effective, least scalable form of teaching and makes it something a school can offer to everyone, every day.</w:t>
       </w:r>
     </w:p>
     <w:sectPr>

</xml_diff>